<commit_message>
wip rework in sheet to docs
</commit_message>
<xml_diff>
--- a/template example sheet2docs.docx
+++ b/template example sheet2docs.docx
@@ -202,6 +202,278 @@
         </w:rPr>
         <w:t>That means &lt;&lt;name&gt;&gt; has &lt;&lt;pass?&gt;&gt; the class.</w:t>
       </w:r>
+    </w:p>
+    <w:p>
+      <w:pPr>
+        <w:rPr>
+          <w:lang w:val="en-US"/>
+        </w:rPr>
+      </w:pPr>
+    </w:p>
+    <w:tbl>
+      <w:tblPr>
+        <w:tblStyle w:val="Tablaconcuadrcula"/>
+        <w:tblW w:w="0" w:type="auto"/>
+        <w:tblLook w:val="04A0" w:firstRow="1" w:lastRow="0" w:firstColumn="1" w:lastColumn="0" w:noHBand="0" w:noVBand="1"/>
+      </w:tblPr>
+      <w:tblGrid>
+        <w:gridCol w:w="4414"/>
+        <w:gridCol w:w="4414"/>
+      </w:tblGrid>
+      <w:tr>
+        <w:tc>
+          <w:tcPr>
+            <w:tcW w:w="4414" w:type="dxa"/>
+          </w:tcPr>
+          <w:p>
+            <w:pPr>
+              <w:rPr>
+                <w:b/>
+                <w:bCs/>
+                <w:lang w:val="en-US"/>
+              </w:rPr>
+            </w:pPr>
+            <w:r>
+              <w:rPr>
+                <w:b/>
+                <w:bCs/>
+                <w:lang w:val="en-US"/>
+              </w:rPr>
+              <w:t>Name</w:t>
+            </w:r>
+          </w:p>
+        </w:tc>
+        <w:tc>
+          <w:tcPr>
+            <w:tcW w:w="4414" w:type="dxa"/>
+          </w:tcPr>
+          <w:p>
+            <w:pPr>
+              <w:rPr>
+                <w:lang w:val="en-US"/>
+              </w:rPr>
+            </w:pPr>
+            <w:r>
+              <w:rPr>
+                <w:lang w:val="en-US"/>
+              </w:rPr>
+              <w:t>&lt;&lt;name&gt;&gt;</w:t>
+            </w:r>
+          </w:p>
+        </w:tc>
+      </w:tr>
+      <w:tr>
+        <w:tc>
+          <w:tcPr>
+            <w:tcW w:w="4414" w:type="dxa"/>
+          </w:tcPr>
+          <w:p>
+            <w:pPr>
+              <w:rPr>
+                <w:lang w:val="en-US"/>
+              </w:rPr>
+            </w:pPr>
+            <w:r>
+              <w:rPr>
+                <w:lang w:val="en-US"/>
+              </w:rPr>
+              <w:t>Animal</w:t>
+            </w:r>
+          </w:p>
+        </w:tc>
+        <w:tc>
+          <w:tcPr>
+            <w:tcW w:w="4414" w:type="dxa"/>
+          </w:tcPr>
+          <w:p>
+            <w:pPr>
+              <w:rPr>
+                <w:lang w:val="en-US"/>
+              </w:rPr>
+            </w:pPr>
+            <w:r>
+              <w:rPr>
+                <w:lang w:val="en-US"/>
+              </w:rPr>
+              <w:t>&lt;&lt;animal&gt;&gt;</w:t>
+            </w:r>
+          </w:p>
+        </w:tc>
+      </w:tr>
+      <w:tr>
+        <w:tc>
+          <w:tcPr>
+            <w:tcW w:w="4414" w:type="dxa"/>
+          </w:tcPr>
+          <w:p>
+            <w:pPr>
+              <w:rPr>
+                <w:lang w:val="en-US"/>
+              </w:rPr>
+            </w:pPr>
+            <w:r>
+              <w:rPr>
+                <w:lang w:val="en-US"/>
+              </w:rPr>
+              <w:t>Score 1</w:t>
+            </w:r>
+          </w:p>
+        </w:tc>
+        <w:tc>
+          <w:tcPr>
+            <w:tcW w:w="4414" w:type="dxa"/>
+          </w:tcPr>
+          <w:p>
+            <w:pPr>
+              <w:rPr>
+                <w:lang w:val="en-US"/>
+              </w:rPr>
+            </w:pPr>
+            <w:r>
+              <w:rPr>
+                <w:lang w:val="en-US"/>
+              </w:rPr>
+              <w:t>&lt;&lt;score1&gt;&gt;</w:t>
+            </w:r>
+          </w:p>
+        </w:tc>
+      </w:tr>
+      <w:tr>
+        <w:tc>
+          <w:tcPr>
+            <w:tcW w:w="4414" w:type="dxa"/>
+          </w:tcPr>
+          <w:p>
+            <w:pPr>
+              <w:rPr>
+                <w:lang w:val="en-US"/>
+              </w:rPr>
+            </w:pPr>
+            <w:r>
+              <w:rPr>
+                <w:lang w:val="en-US"/>
+              </w:rPr>
+              <w:t>Score 2</w:t>
+            </w:r>
+          </w:p>
+        </w:tc>
+        <w:tc>
+          <w:tcPr>
+            <w:tcW w:w="4414" w:type="dxa"/>
+          </w:tcPr>
+          <w:p>
+            <w:pPr>
+              <w:rPr>
+                <w:lang w:val="en-US"/>
+              </w:rPr>
+            </w:pPr>
+            <w:r>
+              <w:rPr>
+                <w:lang w:val="en-US"/>
+              </w:rPr>
+              <w:t>&lt;&lt;score2&gt;&gt;</w:t>
+            </w:r>
+          </w:p>
+        </w:tc>
+      </w:tr>
+      <w:tr>
+        <w:tc>
+          <w:tcPr>
+            <w:tcW w:w="4414" w:type="dxa"/>
+          </w:tcPr>
+          <w:p>
+            <w:pPr>
+              <w:rPr>
+                <w:lang w:val="en-US"/>
+              </w:rPr>
+            </w:pPr>
+            <w:r>
+              <w:rPr>
+                <w:lang w:val="en-US"/>
+              </w:rPr>
+              <w:t>Total Score</w:t>
+            </w:r>
+          </w:p>
+        </w:tc>
+        <w:tc>
+          <w:tcPr>
+            <w:tcW w:w="4414" w:type="dxa"/>
+          </w:tcPr>
+          <w:p>
+            <w:pPr>
+              <w:rPr>
+                <w:lang w:val="en-US"/>
+              </w:rPr>
+            </w:pPr>
+            <w:r>
+              <w:rPr>
+                <w:lang w:val="en-US"/>
+              </w:rPr>
+              <w:t>&lt;&lt;</w:t>
+            </w:r>
+            <w:proofErr w:type="spellStart"/>
+            <w:r>
+              <w:rPr>
+                <w:lang w:val="en-US"/>
+              </w:rPr>
+              <w:t>score_total</w:t>
+            </w:r>
+            <w:proofErr w:type="spellEnd"/>
+            <w:r>
+              <w:rPr>
+                <w:lang w:val="en-US"/>
+              </w:rPr>
+              <w:t>&gt;&gt;</w:t>
+            </w:r>
+          </w:p>
+        </w:tc>
+      </w:tr>
+      <w:tr>
+        <w:tc>
+          <w:tcPr>
+            <w:tcW w:w="4414" w:type="dxa"/>
+          </w:tcPr>
+          <w:p>
+            <w:pPr>
+              <w:rPr>
+                <w:u w:val="single"/>
+                <w:lang w:val="en-US"/>
+              </w:rPr>
+            </w:pPr>
+            <w:r>
+              <w:rPr>
+                <w:lang w:val="en-US"/>
+              </w:rPr>
+              <w:t>Did it pass?</w:t>
+            </w:r>
+          </w:p>
+        </w:tc>
+        <w:tc>
+          <w:tcPr>
+            <w:tcW w:w="4414" w:type="dxa"/>
+          </w:tcPr>
+          <w:p>
+            <w:pPr>
+              <w:rPr>
+                <w:lang w:val="en-US"/>
+              </w:rPr>
+            </w:pPr>
+            <w:r>
+              <w:rPr>
+                <w:lang w:val="en-US"/>
+              </w:rPr>
+              <w:t>&lt;&lt;pass?&gt;&gt;</w:t>
+            </w:r>
+          </w:p>
+        </w:tc>
+      </w:tr>
+    </w:tbl>
+    <w:p>
+      <w:pPr>
+        <w:rPr>
+          <w:lang w:val="en-US"/>
+        </w:rPr>
+      </w:pPr>
     </w:p>
     <w:sectPr>
       <w:pgSz w:w="12240" w:h="15840"/>
@@ -1319,6 +1591,25 @@
       <w:spacing w:val="5"/>
     </w:rPr>
   </w:style>
+  <w:style w:type="table" w:styleId="Tablaconcuadrcula">
+    <w:name w:val="Table Grid"/>
+    <w:basedOn w:val="Tablanormal"/>
+    <w:uiPriority w:val="39"/>
+    <w:rsid w:val="00D84CB1"/>
+    <w:pPr>
+      <w:spacing w:after="0" w:line="240" w:lineRule="auto"/>
+    </w:pPr>
+    <w:tblPr>
+      <w:tblBorders>
+        <w:top w:val="single" w:sz="4" w:space="0" w:color="auto"/>
+        <w:left w:val="single" w:sz="4" w:space="0" w:color="auto"/>
+        <w:bottom w:val="single" w:sz="4" w:space="0" w:color="auto"/>
+        <w:right w:val="single" w:sz="4" w:space="0" w:color="auto"/>
+        <w:insideH w:val="single" w:sz="4" w:space="0" w:color="auto"/>
+        <w:insideV w:val="single" w:sz="4" w:space="0" w:color="auto"/>
+      </w:tblBorders>
+    </w:tblPr>
+  </w:style>
 </w:styles>
 </file>
 

</xml_diff>